<commit_message>
docs: refresh rc12 guide and prepare continuous narration candidates
</commit_message>
<xml_diff>
--- a/example/competition-materials/rc12/学途智伴技能说明文档.docx
+++ b/example/competition-materials/rc12/学途智伴技能说明文档.docx
@@ -191,7 +191,7 @@
     </w:p>
     <w:p>
       <w:r>
-        <w:t>正式课保持知识主线，推进一个新的学习目标；补充课集中处理上一课的具体问题。在案例中，第二课出现“没有 Thought 就没有注入风险”的误解，下一轮同时交付安全工具契约正式课与独立补充页。两类课程有清晰标签、关联导航和独立记录，不必先完成补充才进入正式课。</w:t>
+        <w:t>正式课推进新目标，补充课处理上节课的具体问题。针对“没有 Thought 就没有注入风险”的误解，下一轮配套安全工具契约正式课与补充页。两类课程独立记录，不必先完成补充才能进入正式课。</w:t>
       </w:r>
     </w:p>
     <w:p>
@@ -204,7 +204,7 @@
     </w:p>
     <w:p>
       <w:r>
-        <w:t>课程以图解建立关系，再用逐行代码、即时检查和开放练习验证理解。论文、官方文档和视频按学习目标选择，给出具体阅读片段与产出任务；课程保留主题一致的视觉风格、冻结工具栏与可折叠导航。</w:t>
+        <w:t>图解先建立关系，再用代码和练习验证理解。论文、文档与视频按目标选取，标明定位、预算和产出；视频只用链接，选读折叠。各页风格一致，支持冻结工具栏和折叠导航。</w:t>
       </w:r>
     </w:p>
     <w:p>
@@ -252,7 +252,7 @@
         <w:pStyle w:val="ListNumber"/>
       </w:pPr>
       <w:r>
-        <w:t>学习一节课。按图解和代码理解内容，先独立完成练习，再查看反馈，把理由和疑难写在页尾。</w:t>
+        <w:t>学习一节课。按图解和代码理解内容，完成练习并查看反馈；选看视频时，先预测、暂停画图，再闭卷解释，把产出和疑难写在页尾。</w:t>
       </w:r>
     </w:p>
     <w:p>
@@ -1012,7 +1012,7 @@
               <w:rPr>
                 <w:sz w:val="21"/>
               </w:rPr>
-              <w:t>课内模型连接</w:t>
+              <w:t>资源导学</w:t>
             </w:r>
           </w:p>
         </w:tc>
@@ -1044,6 +1044,104 @@
               <w:rPr>
                 <w:sz w:val="21"/>
               </w:rPr>
+              <w:t>两个中文视频提供精确链接和课内产出任务</w:t>
+            </w:r>
+          </w:p>
+        </w:tc>
+        <w:tc>
+          <w:tcPr>
+            <w:tcW w:type="dxa" w:w="3211"/>
+            <w:vAlign w:val="center"/>
+            <w:tcBorders>
+              <w:top w:val="single" w:sz="4" w:color="D9D9D9"/>
+              <w:left w:val="single" w:sz="4" w:color="D9D9D9"/>
+              <w:bottom w:val="single" w:sz="4" w:color="D9D9D9"/>
+              <w:right w:val="single" w:sz="4" w:color="D9D9D9"/>
+              <w:insideH w:val="single" w:sz="4" w:color="D9D9D9"/>
+              <w:insideV w:val="single" w:sz="4" w:color="D9D9D9"/>
+            </w:tcBorders>
+            <w:tcMar>
+              <w:top w:w="100" w:type="dxa"/>
+              <w:left w:w="100" w:type="dxa"/>
+              <w:bottom w:w="100" w:type="dxa"/>
+              <w:right w:w="100" w:type="dxa"/>
+            </w:tcMar>
+            <w:shd w:fill="FFFFFF"/>
+          </w:tcPr>
+          <w:p>
+            <w:pPr>
+              <w:spacing w:before="40" w:after="40" w:line="283" w:lineRule="auto"/>
+            </w:pPr>
+            <w:r>
+              <w:rPr>
+                <w:sz w:val="21"/>
+              </w:rPr>
+              <w:t>来源核对及交互检查</w:t>
+            </w:r>
+          </w:p>
+        </w:tc>
+      </w:tr>
+      <w:tr>
+        <w:tc>
+          <w:tcPr>
+            <w:tcW w:type="dxa" w:w="2045"/>
+            <w:vAlign w:val="center"/>
+            <w:tcBorders>
+              <w:top w:val="single" w:sz="4" w:color="D9D9D9"/>
+              <w:left w:val="single" w:sz="4" w:color="D9D9D9"/>
+              <w:bottom w:val="single" w:sz="4" w:color="D9D9D9"/>
+              <w:right w:val="single" w:sz="4" w:color="D9D9D9"/>
+              <w:insideH w:val="single" w:sz="4" w:color="D9D9D9"/>
+              <w:insideV w:val="single" w:sz="4" w:color="D9D9D9"/>
+            </w:tcBorders>
+            <w:tcMar>
+              <w:top w:w="100" w:type="dxa"/>
+              <w:left w:w="100" w:type="dxa"/>
+              <w:bottom w:w="100" w:type="dxa"/>
+              <w:right w:w="100" w:type="dxa"/>
+            </w:tcMar>
+            <w:shd w:fill="F0F4F8"/>
+          </w:tcPr>
+          <w:p>
+            <w:pPr>
+              <w:spacing w:before="40" w:after="40" w:line="283" w:lineRule="auto"/>
+            </w:pPr>
+            <w:r>
+              <w:rPr>
+                <w:sz w:val="21"/>
+              </w:rPr>
+              <w:t>课内模型连接</w:t>
+            </w:r>
+          </w:p>
+        </w:tc>
+        <w:tc>
+          <w:tcPr>
+            <w:tcW w:type="dxa" w:w="4680"/>
+            <w:vAlign w:val="center"/>
+            <w:tcBorders>
+              <w:top w:val="single" w:sz="4" w:color="D9D9D9"/>
+              <w:left w:val="single" w:sz="4" w:color="D9D9D9"/>
+              <w:bottom w:val="single" w:sz="4" w:color="D9D9D9"/>
+              <w:right w:val="single" w:sz="4" w:color="D9D9D9"/>
+              <w:insideH w:val="single" w:sz="4" w:color="D9D9D9"/>
+              <w:insideV w:val="single" w:sz="4" w:color="D9D9D9"/>
+            </w:tcBorders>
+            <w:tcMar>
+              <w:top w:w="100" w:type="dxa"/>
+              <w:left w:w="100" w:type="dxa"/>
+              <w:bottom w:w="100" w:type="dxa"/>
+              <w:right w:w="100" w:type="dxa"/>
+            </w:tcMar>
+            <w:shd w:fill="F0F4F8"/>
+          </w:tcPr>
+          <w:p>
+            <w:pPr>
+              <w:spacing w:before="40" w:after="40" w:line="283" w:lineRule="auto"/>
+            </w:pPr>
+            <w:r>
+              <w:rPr>
+                <w:sz w:val="21"/>
+              </w:rPr>
               <w:t>历史模型获取、测试与多轮真实回答成功</w:t>
             </w:r>
           </w:p>
@@ -1066,7 +1164,7 @@
               <w:bottom w:w="100" w:type="dxa"/>
               <w:right w:w="100" w:type="dxa"/>
             </w:tcMar>
-            <w:shd w:fill="FFFFFF"/>
+            <w:shd w:fill="F0F4F8"/>
           </w:tcPr>
           <w:p>
             <w:pPr>
@@ -1100,7 +1198,7 @@
               <w:bottom w:w="100" w:type="dxa"/>
               <w:right w:w="100" w:type="dxa"/>
             </w:tcMar>
-            <w:shd w:fill="F0F4F8"/>
+            <w:shd w:fill="FFFFFF"/>
           </w:tcPr>
           <w:p>
             <w:pPr>
@@ -1132,7 +1230,7 @@
               <w:bottom w:w="100" w:type="dxa"/>
               <w:right w:w="100" w:type="dxa"/>
             </w:tcMar>
-            <w:shd w:fill="F0F4F8"/>
+            <w:shd w:fill="FFFFFF"/>
           </w:tcPr>
           <w:p>
             <w:pPr>
@@ -1164,7 +1262,7 @@
               <w:bottom w:w="100" w:type="dxa"/>
               <w:right w:w="100" w:type="dxa"/>
             </w:tcMar>
-            <w:shd w:fill="F0F4F8"/>
+            <w:shd w:fill="FFFFFF"/>
           </w:tcPr>
           <w:p>
             <w:pPr>
@@ -1191,7 +1289,7 @@
     </w:p>
     <w:p>
       <w:r>
-        <w:t>三分钟内依次展示评估、图解学习、DeepSeek 设置和真实课内答疑，再展示答案保存与正式课和补充课的分流结果。配置和问答使用真实接口；已整理课程明确作为回放，不把静态展示剪成实时生成。</w:t>
+        <w:t>三分钟内依次展示评估、图解与资源导学、DeepSeek 设置和真实课内答疑，再展示答案保存与正式课和补充课的分流结果。配置和问答使用真实接口；已整理课程明确作为回放，不把静态展示剪成实时生成。</w:t>
       </w:r>
     </w:p>
     <w:p>

</xml_diff>

<commit_message>
Freeze competition materials and add verified submission packaging
</commit_message>
<xml_diff>
--- a/example/competition-materials/rc12/学途智伴技能说明文档.docx
+++ b/example/competition-materials/rc12/学途智伴技能说明文档.docx
@@ -20,7 +20,7 @@
     </w:p>
     <w:p>
       <w:r>
-        <w:t>重邮FFBond  ·  校园生活赛道  ·  Teach Pro 1.1.0-rc.12  ·  2026年10月5日</w:t>
+        <w:t>重邮FFBond  ·  校园生活赛道  ·  Teach Pro 1.1.0-rc.12  ·  2026年10月6日</w:t>
       </w:r>
     </w:p>
     <w:p>
@@ -33,7 +33,7 @@
     </w:p>
     <w:p>
       <w:r>
-        <w:t>学途智伴是一套面向大学生自主学习的 Skill。它先了解基础、目标和时间安排，再逐课生成可阅读、可作答的网页教程；依据保存的练习答案和疑难，调整下一节正式课，并按需配套独立补充课。</w:t>
+        <w:t>学途智伴是一套面向大学生自主学习的 Skill 技能包。它先了解基础、目标和时间安排，再逐课生成可阅读、可作答的网页教程；依据保存的练习答案和疑难，调整下一节正式课，并按需配套独立补充课。</w:t>
       </w:r>
     </w:p>
     <w:p>
@@ -333,7 +333,7 @@
     </w:p>
     <w:p>
       <w:r>
-        <w:t>AI 设置统一位于左侧导航顶部，连接全课程共用。以 DeepSeek 为例，选取服务类型会自动填充基础地址；输入 API Key 后，点击“获取模型”，从返回的列表选择模型，再保存并测试连接。具体模型以实际接口返回为准。</w:t>
+        <w:t>学习中遇到疑问，点击冻结栏左侧的“问 AI”。首次使用可从答疑窗口进入“连接答疑模型”，也可直接打开左侧置顶的“课程设置”。以 DeepSeek 为例，选取服务类型、输入 API Key、获取并选择模型，再保存并测试连接。连接全课程共用。</w:t>
       </w:r>
     </w:p>
     <w:p>
@@ -397,7 +397,7 @@
     </w:p>
     <w:p>
       <w:r>
-        <w:t>返回课程后，冻结栏左侧的“问 AI”打开居中大弹窗。Tutor 结合本课正文与最近对话回答，支持多轮交流、流式显示和 Markdown 排版；输入与发送位于同一行。聊天按课保存，续课教学 AI 可以读取。</w:t>
+        <w:t>从答疑入口进入设置时，测试成功后点击“返回第一课”，会回到同一课的答疑窗口。Tutor 结合本课正文与最近对话回答，支持多轮交流、流式显示和 Markdown 排版；输入与发送位于同一行。聊天按课保存，续课教学 AI 可以读取。</w:t>
       </w:r>
     </w:p>
     <w:p>
@@ -1142,7 +1142,7 @@
               <w:rPr>
                 <w:sz w:val="21"/>
               </w:rPr>
-              <w:t>历史模型获取、测试与多轮真实回答成功</w:t>
+              <w:t>DeepSeek 模型获取、连接测试与两轮流式答疑成功</w:t>
             </w:r>
           </w:p>
         </w:tc>
@@ -1174,7 +1174,7 @@
               <w:rPr>
                 <w:sz w:val="21"/>
               </w:rPr>
-              <w:t>历史证据；新版需重录</w:t>
+              <w:t>本轮隔离实录与接口记录</w:t>
             </w:r>
           </w:p>
         </w:tc>
@@ -1289,7 +1289,7 @@
     </w:p>
     <w:p>
       <w:r>
-        <w:t>三分钟内依次展示评估、图解与资源导学、DeepSeek 设置和真实课内答疑，再展示答案保存与正式课和补充课的分流结果。配置和问答使用真实接口；已整理课程明确作为回放，不把静态展示剪成实时生成。</w:t>
+        <w:t>最终视频长 2 分 48 秒。先明确学习目标，展示评估、图解、代码和资源导学；学生遇到代码疑问后，再连接 DeepSeek，返回本课提问并追问。最后展示记录保存、续课请求及正式课与补充课的分流结果。配置和两轮答疑使用真实接口，续课部分为已生成课程回放。</w:t>
       </w:r>
     </w:p>
     <w:p>
@@ -1321,7 +1321,7 @@
           <w:rPr>
             <w:color w:val="2456A6"/>
           </w:rPr>
-          <w:t>合成大学生续课验证记录</w:t>
+          <w:t>渐进演示与真实模型请求记录</w:t>
         </w:r>
       </w:hyperlink>
     </w:p>

</xml_diff>

<commit_message>
Integrate workflow architecture into competition document and video opening
</commit_message>
<xml_diff>
--- a/example/competition-materials/rc12/学途智伴技能说明文档.docx
+++ b/example/competition-materials/rc12/学途智伴技能说明文档.docx
@@ -20,7 +20,7 @@
     </w:p>
     <w:p>
       <w:r>
-        <w:t>重邮FFBond  ·  校园生活赛道  ·  Teach Pro 1.1.0-rc.12  ·  2026年10月6日</w:t>
+        <w:t>重邮FFBond  ·  校园生活赛道  ·  Teach Pro 1.1.0-rc.12  ·  2026年10月10日</w:t>
       </w:r>
     </w:p>
     <w:p>
@@ -110,8 +110,11 @@
       </w:r>
     </w:p>
     <w:p>
+      <w:pPr>
+        <w:pStyle w:val="Heading2"/>
+      </w:pPr>
       <w:r>
-        <w:t>系统把教学决策、学习工作区和可选答疑分开。Skill 约束教学 AI 的工作流程；网页负责呈现和输入；本地服务保存记录，并代网页连接答疑模型。</w:t>
+        <w:t>工作流程与系统架构</w:t>
       </w:r>
     </w:p>
     <w:p>
@@ -123,8 +126,8 @@
       <w:r>
         <w:drawing>
           <wp:inline xmlns:a="http://schemas.openxmlformats.org/drawingml/2006/main" xmlns:pic="http://schemas.openxmlformats.org/drawingml/2006/picture">
-            <wp:extent cx="6309360" cy="2351671"/>
-            <wp:docPr id="2" name="Picture 2" descr="教学 AI 读取本地工作区决定下一轮课程，可选 Tutor 将课内对话保存到同一工作区"/>
+            <wp:extent cx="6309360" cy="3550902"/>
+            <wp:docPr id="2" name="Picture 2" descr="访谈、评估、逐课教学、作答、证据审阅与自适应续课；宿主教学 AI、浏览器、本地服务、可选 Tutor 与本地课程工作区分工"/>
             <wp:cNvGraphicFramePr>
               <a:graphicFrameLocks noChangeAspect="1"/>
             </wp:cNvGraphicFramePr>
@@ -132,7 +135,7 @@
               <a:graphicData uri="http://schemas.openxmlformats.org/drawingml/2006/picture">
                 <pic:pic>
                   <pic:nvPicPr>
-                    <pic:cNvPr id="0" name="architecture.png"/>
+                    <pic:cNvPr id="0" name="teach-pro-workflow-architecture-v1.png"/>
                     <pic:cNvPicPr/>
                   </pic:nvPicPr>
                   <pic:blipFill>
@@ -144,7 +147,7 @@
                   <pic:spPr>
                     <a:xfrm>
                       <a:off x="0" y="0"/>
-                      <a:ext cx="6309360" cy="2351671"/>
+                      <a:ext cx="6309360" cy="3550902"/>
                     </a:xfrm>
                     <a:prstGeom prst="rect"/>
                   </pic:spPr>
@@ -165,7 +168,17 @@
           <w:color w:val="43536A"/>
           <w:sz w:val="20"/>
         </w:rPr>
-        <w:t>图 2  教学协议与本地学习记录的关系</w:t>
+        <w:t>图 2  学习闭环与系统职责</w:t>
+      </w:r>
+    </w:p>
+    <w:p>
+      <w:r>
+        <w:t>学员在宿主中调用 Skill，教学 AI 先访谈和评估，再生成一节课。学员在网页阅读、作答和提问；请求继续后，教学 AI 读取本地记录，决定下一课，并按需提供独立补充课。</w:t>
+      </w:r>
+    </w:p>
+    <w:p>
+      <w:r>
+        <w:t>教学 AI 负责教学决策与课程生成；课内 Tutor 解释本课疑问；本地 Python 服务同步文件及问答请求。答案与聊天分别写入 learner-submissions 和 learner-chats，画像、路线与课程状态用 Markdown 保存，供新会话接续教学。</w:t>
       </w:r>
     </w:p>
     <w:p>
@@ -178,7 +191,7 @@
     </w:p>
     <w:p>
       <w:r>
-        <w:t>下一课不是按序号自动翻页。教学 AI 先读取当前作答和疑难，区分识别正确、能解释、能应用和能迁移的证据。课内答疑可补充理解线索，但不能把 AI 给出的答案直接记为学生已经掌握。</w:t>
+        <w:t>教学 AI 读取作答和疑难，依据学生自己的识别、解释、应用和迁移表现调整下一课。课内答疑补充理解线索，练习记录提供掌握证据，让教学从已学会的地方接着推进。</w:t>
       </w:r>
     </w:p>
     <w:p>
@@ -191,33 +204,7 @@
     </w:p>
     <w:p>
       <w:r>
-        <w:t>正式课推进新目标，补充课处理上节课的具体问题。针对“没有 Thought 就没有注入风险”的误解，下一轮配套安全工具契约正式课与补充页。两类课程独立记录，不必先完成补充才能进入正式课。</w:t>
-      </w:r>
-    </w:p>
-    <w:p>
-      <w:pPr>
-        <w:pStyle w:val="Heading2"/>
-      </w:pPr>
-      <w:r>
-        <w:t>理解优先的课程内容</w:t>
-      </w:r>
-    </w:p>
-    <w:p>
-      <w:r>
-        <w:t>图解先建立关系，再用代码和练习验证理解。论文、文档与视频按目标选取，标明定位、预算和产出；视频只用链接，选读折叠。各页风格一致，支持冻结工具栏和折叠导航。</w:t>
-      </w:r>
-    </w:p>
-    <w:p>
-      <w:pPr>
-        <w:pStyle w:val="Heading2"/>
-      </w:pPr>
-      <w:r>
-        <w:t>跨会话的文件连续性</w:t>
-      </w:r>
-    </w:p>
-    <w:p>
-      <w:r>
-        <w:t>评估和答案写入 learner-submissions，对话按课写入 learner-chats；课程状态、画像和路线使用 Markdown 文件。教学 AI 在新的会话中读取这些文件即可接续，不要求学生重新复述完整学习过程。</w:t>
+        <w:t>正式课推进新目标，补充课巩固具体难点，两类课程独立记录。例如，安全工具契约正式课推进主线，关联补充课澄清“没有 Thought 就没有注入风险”的误解。</w:t>
       </w:r>
     </w:p>
     <w:p>
@@ -319,7 +306,7 @@
     </w:p>
     <w:p>
       <w:r>
-        <w:t>从启动器打开时，输入自动落盘；直接打开 HTML 可以阅读，答案只保存在浏览器。公开 Demo 已整理好展示课程，体验者的新作答由自己的本地副本保存。</w:t>
+        <w:t>课程启动器支持输入自动落盘；HTML 支持直接阅读和浏览器保存。Demo 提供完整展示课程，体验者的作答保存在自己的本地副本，后续可由教学 AI 读取并用于续课。</w:t>
       </w:r>
     </w:p>
     <w:p>
@@ -392,7 +379,7 @@
     </w:p>
     <w:p>
       <w:r>
-        <w:t>默认记住此设备，启动器准备 keyring 运行依赖，由系统凭据库存储密钥。页面配置文件不保存明文 Key；断开连接与删除已保存密钥分别处理。录制演示时不点击显示密钥。</w:t>
+        <w:t>默认记住此设备，启动器自动准备 keyring 运行依赖，系统凭据库存储密钥。API Key 输入默认遮蔽，眼睛按钮切换显示；模型连接全课程共用，切换课程后可直接继续答疑。</w:t>
       </w:r>
     </w:p>
     <w:p>
@@ -456,7 +443,7 @@
     </w:p>
     <w:p>
       <w:r>
-        <w:t>课内 Tutor 解释当前课，生成课程的教学 AI 管理路线与下一课。这两个入口职责不同；不连接 Tutor 也能完成阅读、练习与本地作答。</w:t>
+        <w:t>课内 Tutor 专注当前课的理解与多轮交流，教学 AI 管理路线与下一课。阅读、练习和本地作答组成核心学习流程，学生可按需连接答疑模型。</w:t>
       </w:r>
     </w:p>
     <w:p>
@@ -470,7 +457,7 @@
     </w:p>
     <w:p>
       <w:r>
-        <w:t>验证保留原始失败和人工修订记录。当前 Demo 使用合成学习场景，课程内容经人工校核；它用于展示教学流程，不将合成作答记为真实学生成绩。</w:t>
+        <w:t>通过可复现的学习场景检验页面、作答保存、课内答疑和续课交付。Demo 展示从评估到学习、提问和继续下一课的完整流程，配套记录支持逐项核对。</w:t>
       </w:r>
     </w:p>
     <w:tbl>
@@ -1272,7 +1259,7 @@
               <w:rPr>
                 <w:sz w:val="21"/>
               </w:rPr>
-              <w:t>实机验收限 Windows</w:t>
+              <w:t>启动器检查与 Windows 验收</w:t>
             </w:r>
           </w:p>
         </w:tc>
@@ -1289,7 +1276,7 @@
     </w:p>
     <w:p>
       <w:r>
-        <w:t>最终视频长 2 分 48 秒。先明确学习目标，展示评估、图解、代码和资源导学；学生遇到代码疑问后，再连接 DeepSeek，返回本课提问并追问。最后展示记录保存、续课请求及正式课与补充课的分流结果。配置和两轮答疑使用真实接口，续课部分为已生成课程回放。</w:t>
+        <w:t>演示视频长 2 分 58 秒。从架构图和学习目标出发，依次展示评估、图解、代码与资源；遇到疑问后连接 DeepSeek，返回本课进行两轮真实答疑，再展示保存与续课。正式课推进主线，补充课巩固难点，串联完整学习闭环。</w:t>
       </w:r>
     </w:p>
     <w:p>
@@ -1302,7 +1289,7 @@
     </w:p>
     <w:p>
       <w:r>
-        <w:t>技能包包含 SKILL.md、教学参考、模板与运行资源，配套说明文档和演示视频。公开仓库保留版本和验证记录，学员答案、聊天及模型凭据不随包发布。</w:t>
+        <w:t>技能包包含 SKILL.md、教学参考、模板与运行资源，配套说明文档、架构图和演示视频。公开仓库保留版本与验证记录；课程目录承载个人学习进度，支持跨会话接续教学。</w:t>
       </w:r>
     </w:p>
     <w:p>

</xml_diff>

<commit_message>
docs: clarify long-term learning value across release profiles
</commit_message>
<xml_diff>
--- a/example/competition-materials/rc12/学途智伴技能说明文档.docx
+++ b/example/competition-materials/rc12/学途智伴技能说明文档.docx
@@ -33,12 +33,12 @@
     </w:p>
     <w:p>
       <w:r>
-        <w:t>学途智伴是一套面向大学生自主学习的 Skill 技能包。它先了解基础、目标和时间安排，再逐课生成可阅读、可作答的网页教程；依据保存的练习答案和疑难，调整下一节正式课，并按需配套独立补充课。</w:t>
+        <w:t>大学生的系统学习常跨越数周乃至数月。课程、笔记、练习与 AI 对话分散在不同位置，学习中断后需要重新整理进度；遇到难点时，还需判断是继续新课还是补充基础。</w:t>
       </w:r>
     </w:p>
     <w:p>
       <w:r>
-        <w:t>大学生长期学习常遇到路线过大、遇到难点无人解释、新会话丢失进度的问题。本作品把评估、讲解、练习和续课连接在同一个本地课程目录中，让教学 AI 能接着上一次的学习记录继续教。</w:t>
+        <w:t>学途智伴是一套自适应教学 Skill 技能包，把学习目标、课程与本地学习记录连接起来。先访谈和评估，再逐课生成网页教程；教学 AI 读取作答与疑难，调整下一课并按需提供独立补充课，让学生专注学习、作答和提问，减少反复说明背景与自行编排课程的负担。</w:t>
       </w:r>
     </w:p>
     <w:p>
@@ -191,7 +191,7 @@
     </w:p>
     <w:p>
       <w:r>
-        <w:t>教学 AI 读取作答和疑难，依据学生自己的识别、解释、应用和迁移表现调整下一课。课内答疑补充理解线索，练习记录提供掌握证据，让教学从已学会的地方接着推进。</w:t>
+        <w:t>教学 AI 读取作答和疑难，依据学生的识别、解释、应用和迁移表现调整目标、难度与练习支架。课内答疑补充理解线索，练习记录提供能力判断依据，让下一次教学接着上一次的实际表现推进。</w:t>
       </w:r>
     </w:p>
     <w:p>

</xml_diff>

<commit_message>
Refresh rc.15 competition media and clarify lesson numbering
</commit_message>
<xml_diff>
--- a/example/competition-materials/rc12/学途智伴技能说明文档.docx
+++ b/example/competition-materials/rc12/学途智伴技能说明文档.docx
@@ -20,7 +20,7 @@
     </w:p>
     <w:p>
       <w:r>
-        <w:t>重邮FFBond  ·  校园生活赛道  ·  Teach Pro 1.1.0-rc.12  ·  2026年10月10日</w:t>
+        <w:t>重邮FFBond  ·  校园生活赛道  ·  Teach Pro 1.1.0-rc.15  ·  2026年10月26日</w:t>
       </w:r>
     </w:p>
     <w:p>
@@ -178,7 +178,7 @@
     </w:p>
     <w:p>
       <w:r>
-        <w:t>教学 AI 负责教学决策与课程生成；课内 Tutor 解释本课疑问；本地 Python 服务同步文件及问答请求。答案与聊天分别写入 learner-submissions 和 learner-chats，画像、路线与课程状态用 Markdown 保存，供新会话接续教学。</w:t>
+        <w:t>教学 AI 负责教学决策与课程生成；课内 Tutor 结合整门已生成教材解释疑问，并标明当前提问课页；本地 Python 服务同步文件及问答请求。答案与聊天分别写入 learner-submissions 和 learner-chats，画像、路线与课程状态用 Markdown 保存，供新会话接续教学。</w:t>
       </w:r>
     </w:p>
     <w:p>
@@ -239,7 +239,7 @@
         <w:pStyle w:val="ListNumber"/>
       </w:pPr>
       <w:r>
-        <w:t>学习一节课。按图解和代码理解内容，完成练习并查看反馈；选看视频时，先预测、暂停画图，再闭卷解释，把产出和疑难写在页尾。</w:t>
+        <w:t>学习一节课。按图解和代码理解内容，在每道练习后直接作答并查看反馈；资源学习任务就地记录产出，课末只保留疑难。选看视频时先预测、暂停画图，再闭卷解释。</w:t>
       </w:r>
     </w:p>
     <w:p>
@@ -384,7 +384,7 @@
     </w:p>
     <w:p>
       <w:r>
-        <w:t>从答疑入口进入设置时，测试成功后点击“返回第一课”，会回到同一课的答疑窗口。Tutor 结合本课正文与最近对话回答，支持多轮交流、流式显示和 Markdown 排版；输入与发送位于同一行。聊天按课保存，续课教学 AI 可以读取。</w:t>
+        <w:t>从答疑进入设置后，点击返回按钮即可回到原课。Tutor 默认结合整门已生成网页教材与本课最近对话回答，选文附带章节和所在段落；即使联系前课，也明确当前提问位置。回答真实流式显示，支持 Markdown 排版和手动继续，聊天按课保存，供续课教学 AI 参考。</w:t>
       </w:r>
     </w:p>
     <w:p>
@@ -396,8 +396,8 @@
       <w:r>
         <w:drawing>
           <wp:inline xmlns:a="http://schemas.openxmlformats.org/drawingml/2006/main" xmlns:pic="http://schemas.openxmlformats.org/drawingml/2006/picture">
-            <wp:extent cx="5303520" cy="3171540"/>
-            <wp:docPr id="5" name="Picture 5" descr="新版答疑弹窗的未连接状态，本图不包含模型生成回答"/>
+            <wp:extent cx="6309360" cy="1873739"/>
+            <wp:docPr id="5" name="Picture 5" descr="整门已生成课程或仅当前课、参考答案、资源导学、本课对话轮数均可配置"/>
             <wp:cNvGraphicFramePr>
               <a:graphicFrameLocks noChangeAspect="1"/>
             </wp:cNvGraphicFramePr>
@@ -405,7 +405,7 @@
               <a:graphicData uri="http://schemas.openxmlformats.org/drawingml/2006/picture">
                 <pic:pic>
                   <pic:nvPicPr>
-                    <pic:cNvPr id="0" name="tutor-dialog.png"/>
+                    <pic:cNvPr id="0" name="context-settings.png"/>
                     <pic:cNvPicPr/>
                   </pic:nvPicPr>
                   <pic:blipFill>
@@ -417,7 +417,7 @@
                   <pic:spPr>
                     <a:xfrm>
                       <a:off x="0" y="0"/>
-                      <a:ext cx="5303520" cy="3171540"/>
+                      <a:ext cx="6309360" cy="1873739"/>
                     </a:xfrm>
                     <a:prstGeom prst="rect"/>
                   </pic:spPr>
@@ -438,12 +438,12 @@
           <w:color w:val="43536A"/>
           <w:sz w:val="20"/>
         </w:rPr>
-        <w:t>图 5  课内答疑入口与紧凑输入区</w:t>
+        <w:t>图 5  统一上下文设置</w:t>
       </w:r>
     </w:p>
     <w:p>
       <w:r>
-        <w:t>课内 Tutor 专注当前课的理解与多轮交流，教学 AI 管理路线与下一课。阅读、练习和本地作答组成核心学习流程，学生可按需连接答疑模型。</w:t>
+        <w:t>上下文设置可选择整门教材或仅当前课，控制是否包含参考答案与资源导学，选择最近五轮、十轮或本课全部已完成对话。默认带入整门教材、参考答案和资源导学，保留最近五轮；保存后全课程共用。教学 AI 管理路线与下一课，Tutor 帮助理解和跨课联系。</w:t>
       </w:r>
     </w:p>
     <w:p>
@@ -457,7 +457,7 @@
     </w:p>
     <w:p>
       <w:r>
-        <w:t>通过可复现的学习场景检验页面、作答保存、课内答疑和续课交付。Demo 展示从评估到学习、提问和继续下一课的完整流程，配套记录支持逐项核对。</w:t>
+        <w:t>通过可复现学习场景检验页面、作答保存、答疑与续课交付，配套记录支持逐项核对。</w:t>
       </w:r>
     </w:p>
     <w:tbl>
@@ -1195,7 +1195,7 @@
               <w:rPr>
                 <w:sz w:val="21"/>
               </w:rPr>
-              <w:t>三端运行</w:t>
+              <w:t>教材与选文上下文</w:t>
             </w:r>
           </w:p>
         </w:tc>
@@ -1227,7 +1227,7 @@
               <w:rPr>
                 <w:sz w:val="21"/>
               </w:rPr>
-              <w:t>三端启动器及 keyring 凭据接口已提供</w:t>
+              <w:t>跨课教材、当前提问页和参考答案段落可定位，设置真实生效</w:t>
             </w:r>
           </w:p>
         </w:tc>
@@ -1259,6 +1259,104 @@
               <w:rPr>
                 <w:sz w:val="21"/>
               </w:rPr>
+              <w:t>19项单测及隔离浏览器验证</w:t>
+            </w:r>
+          </w:p>
+        </w:tc>
+      </w:tr>
+      <w:tr>
+        <w:tc>
+          <w:tcPr>
+            <w:tcW w:type="dxa" w:w="2045"/>
+            <w:vAlign w:val="center"/>
+            <w:tcBorders>
+              <w:top w:val="single" w:sz="4" w:color="D9D9D9"/>
+              <w:left w:val="single" w:sz="4" w:color="D9D9D9"/>
+              <w:bottom w:val="single" w:sz="4" w:color="D9D9D9"/>
+              <w:right w:val="single" w:sz="4" w:color="D9D9D9"/>
+              <w:insideH w:val="single" w:sz="4" w:color="D9D9D9"/>
+              <w:insideV w:val="single" w:sz="4" w:color="D9D9D9"/>
+            </w:tcBorders>
+            <w:tcMar>
+              <w:top w:w="100" w:type="dxa"/>
+              <w:left w:w="100" w:type="dxa"/>
+              <w:bottom w:w="100" w:type="dxa"/>
+              <w:right w:w="100" w:type="dxa"/>
+            </w:tcMar>
+            <w:shd w:fill="F0F4F8"/>
+          </w:tcPr>
+          <w:p>
+            <w:pPr>
+              <w:spacing w:before="40" w:after="40" w:line="283" w:lineRule="auto"/>
+            </w:pPr>
+            <w:r>
+              <w:rPr>
+                <w:sz w:val="21"/>
+              </w:rPr>
+              <w:t>三端运行</w:t>
+            </w:r>
+          </w:p>
+        </w:tc>
+        <w:tc>
+          <w:tcPr>
+            <w:tcW w:type="dxa" w:w="4680"/>
+            <w:vAlign w:val="center"/>
+            <w:tcBorders>
+              <w:top w:val="single" w:sz="4" w:color="D9D9D9"/>
+              <w:left w:val="single" w:sz="4" w:color="D9D9D9"/>
+              <w:bottom w:val="single" w:sz="4" w:color="D9D9D9"/>
+              <w:right w:val="single" w:sz="4" w:color="D9D9D9"/>
+              <w:insideH w:val="single" w:sz="4" w:color="D9D9D9"/>
+              <w:insideV w:val="single" w:sz="4" w:color="D9D9D9"/>
+            </w:tcBorders>
+            <w:tcMar>
+              <w:top w:w="100" w:type="dxa"/>
+              <w:left w:w="100" w:type="dxa"/>
+              <w:bottom w:w="100" w:type="dxa"/>
+              <w:right w:w="100" w:type="dxa"/>
+            </w:tcMar>
+            <w:shd w:fill="F0F4F8"/>
+          </w:tcPr>
+          <w:p>
+            <w:pPr>
+              <w:spacing w:before="40" w:after="40" w:line="283" w:lineRule="auto"/>
+            </w:pPr>
+            <w:r>
+              <w:rPr>
+                <w:sz w:val="21"/>
+              </w:rPr>
+              <w:t>三端启动器及 keyring 凭据接口已提供</w:t>
+            </w:r>
+          </w:p>
+        </w:tc>
+        <w:tc>
+          <w:tcPr>
+            <w:tcW w:type="dxa" w:w="3211"/>
+            <w:vAlign w:val="center"/>
+            <w:tcBorders>
+              <w:top w:val="single" w:sz="4" w:color="D9D9D9"/>
+              <w:left w:val="single" w:sz="4" w:color="D9D9D9"/>
+              <w:bottom w:val="single" w:sz="4" w:color="D9D9D9"/>
+              <w:right w:val="single" w:sz="4" w:color="D9D9D9"/>
+              <w:insideH w:val="single" w:sz="4" w:color="D9D9D9"/>
+              <w:insideV w:val="single" w:sz="4" w:color="D9D9D9"/>
+            </w:tcBorders>
+            <w:tcMar>
+              <w:top w:w="100" w:type="dxa"/>
+              <w:left w:w="100" w:type="dxa"/>
+              <w:bottom w:w="100" w:type="dxa"/>
+              <w:right w:w="100" w:type="dxa"/>
+            </w:tcMar>
+            <w:shd w:fill="F0F4F8"/>
+          </w:tcPr>
+          <w:p>
+            <w:pPr>
+              <w:spacing w:before="40" w:after="40" w:line="283" w:lineRule="auto"/>
+            </w:pPr>
+            <w:r>
+              <w:rPr>
+                <w:sz w:val="21"/>
+              </w:rPr>
               <w:t>启动器检查与 Windows 验收</w:t>
             </w:r>
           </w:p>
@@ -1276,7 +1374,7 @@
     </w:p>
     <w:p>
       <w:r>
-        <w:t>演示视频长 2 分 58 秒。从架构图和学习目标出发，依次展示评估、图解、代码与资源；遇到疑问后连接 DeepSeek，返回本课进行两轮真实答疑，再展示保存与续课。正式课推进主线，补充课巩固难点，串联完整学习闭环。</w:t>
+        <w:t>演示视频长 2 分 51 秒。从架构图和学习目标出发，展示评估、图解、代码与资源；遇到疑问后连接 DeepSeek，展示统一上下文设置，返回原课进行两轮真实答疑，再在题后作答、记录疑难并请求续课。正式课推进主线，补充课巩固难点。</w:t>
       </w:r>
     </w:p>
     <w:p>
@@ -1289,7 +1387,7 @@
     </w:p>
     <w:p>
       <w:r>
-        <w:t>技能包包含 SKILL.md、教学参考、模板与运行资源，配套说明文档、架构图和演示视频。公开仓库保留版本与验证记录；课程目录承载个人学习进度，支持跨会话接续教学。</w:t>
+        <w:t>技能包包含教学规则、模板与运行资源，配套说明、架构图和视频。公开仓库保留版本与验证记录，课程目录保存个人学习进度。</w:t>
       </w:r>
     </w:p>
     <w:p>
@@ -1298,17 +1396,7 @@
           <w:rPr>
             <w:color w:val="2456A6"/>
           </w:rPr>
-          <w:t>项目仓库与技能入口</w:t>
-        </w:r>
-      </w:hyperlink>
-    </w:p>
-    <w:p>
-      <w:hyperlink r:id="rId16">
-        <w:r>
-          <w:rPr>
-            <w:color w:val="2456A6"/>
-          </w:rPr>
-          <w:t>渐进演示与真实模型请求记录</w:t>
+          <w:t>项目仓库与验证记录</w:t>
         </w:r>
       </w:hyperlink>
     </w:p>

</xml_diff>

<commit_message>
Add rc.16 branched multimodal tutor conversations and generation controls
</commit_message>
<xml_diff>
--- a/example/competition-materials/rc12/学途智伴技能说明文档.docx
+++ b/example/competition-materials/rc12/学途智伴技能说明文档.docx
@@ -20,7 +20,7 @@
     </w:p>
     <w:p>
       <w:r>
-        <w:t>重邮FFBond  ·  校园生活赛道  ·  Teach Pro 1.1.0-rc.15  ·  2026年10月26日</w:t>
+        <w:t>重邮FFBond  ·  校园生活赛道  ·  Teach Pro 1.1.0-rc.16  ·  2026年10月26日</w:t>
       </w:r>
     </w:p>
     <w:p>
@@ -384,7 +384,7 @@
     </w:p>
     <w:p>
       <w:r>
-        <w:t>从答疑进入设置后，点击返回按钮即可回到原课。Tutor 默认结合整门已生成网页教材与本课最近对话回答，选文附带章节和所在段落；即使联系前课，也明确当前提问位置。回答真实流式显示，支持 Markdown 排版和手动继续，聊天按课保存，供续课教学 AI 参考。</w:t>
+        <w:t>从答疑进入设置后，点击返回按钮即可回到原课。Tutor 默认结合整门已生成网页教材与本课最近对话回答，选文附带章节和所在段落；即使联系前课，也明确当前提问位置。正文与接口返回的思考分区流式显示。支持复制、修改问题、左右切换版本、重新生成与停止；聊天和图片／文本附件按课保存，供续课 AI 参考。</w:t>
       </w:r>
     </w:p>
     <w:p>
@@ -443,7 +443,7 @@
     </w:p>
     <w:p>
       <w:r>
-        <w:t>上下文设置可选择整门教材或仅当前课，控制是否包含参考答案与资源导学，选择最近五轮、十轮或本课全部已完成对话。默认带入整门教材、参考答案和资源导学，保留最近五轮；保存后全课程共用。教学 AI 管理路线与下一课，Tutor 帮助理解和跨课联系。</w:t>
+        <w:t>上下文设置可选择整门教材或仅当前课，控制是否包含参考答案与资源导学，选择最近五轮、十轮或本课全部已完成对话。默认带入整门教材、参考答案和资源导学，保留最近五轮；保存后全课程共用。输入区可快捷选择本次模型与思考程度，上传、粘贴或拖入图片；教学 AI 管理路线与下一课。</w:t>
       </w:r>
     </w:p>
     <w:p>
@@ -1161,7 +1161,7 @@
               <w:rPr>
                 <w:sz w:val="21"/>
               </w:rPr>
-              <w:t>本轮隔离实录与接口记录</w:t>
+              <w:t>已验收实录与接口记录</w:t>
             </w:r>
           </w:p>
         </w:tc>
@@ -1195,7 +1195,7 @@
               <w:rPr>
                 <w:sz w:val="21"/>
               </w:rPr>
-              <w:t>教材与选文上下文</w:t>
+              <w:t>答疑与教材上下文</w:t>
             </w:r>
           </w:p>
         </w:tc>
@@ -1227,7 +1227,7 @@
               <w:rPr>
                 <w:sz w:val="21"/>
               </w:rPr>
-              <w:t>跨课教材、当前提问页和参考答案段落可定位，设置真实生效</w:t>
+              <w:t>跨课定位、分支切换、附件重放与停止均可复核</w:t>
             </w:r>
           </w:p>
         </w:tc>
@@ -1259,7 +1259,7 @@
               <w:rPr>
                 <w:sz w:val="21"/>
               </w:rPr>
-              <w:t>19项单测及隔离浏览器验证</w:t>
+              <w:t>单测及隔离浏览器验证</w:t>
             </w:r>
           </w:p>
         </w:tc>

</xml_diff>

<commit_message>
refactor: adopt direct instructional writing for rc.17
</commit_message>
<xml_diff>
--- a/example/competition-materials/rc12/学途智伴技能说明文档.docx
+++ b/example/competition-materials/rc12/学途智伴技能说明文档.docx
@@ -20,7 +20,7 @@
     </w:p>
     <w:p>
       <w:r>
-        <w:t>重邮FFBond  ·  校园生活赛道  ·  Teach Pro 1.1.0-rc.16  ·  2026年10月26日</w:t>
+        <w:t>重邮FFBond  ·  校园生活赛道  ·  Teach Pro 1.1.0-rc.17  ·  2026年10月28日</w:t>
       </w:r>
     </w:p>
     <w:p>
@@ -126,7 +126,7 @@
       <w:r>
         <w:drawing>
           <wp:inline xmlns:a="http://schemas.openxmlformats.org/drawingml/2006/main" xmlns:pic="http://schemas.openxmlformats.org/drawingml/2006/picture">
-            <wp:extent cx="6309360" cy="3550902"/>
+            <wp:extent cx="5806440" cy="3267859"/>
             <wp:docPr id="2" name="Picture 2" descr="访谈、评估、逐课教学、作答、证据审阅与自适应续课；宿主教学 AI、浏览器、本地服务、可选 Tutor 与本地课程工作区分工"/>
             <wp:cNvGraphicFramePr>
               <a:graphicFrameLocks noChangeAspect="1"/>
@@ -147,7 +147,7 @@
                   <pic:spPr>
                     <a:xfrm>
                       <a:off x="0" y="0"/>
-                      <a:ext cx="6309360" cy="3550902"/>
+                      <a:ext cx="5806440" cy="3267859"/>
                     </a:xfrm>
                     <a:prstGeom prst="rect"/>
                   </pic:spPr>
@@ -178,7 +178,7 @@
     </w:p>
     <w:p>
       <w:r>
-        <w:t>教学 AI 负责教学决策与课程生成；课内 Tutor 结合整门已生成教材解释疑问，并标明当前提问课页；本地 Python 服务同步文件及问答请求。答案与聊天分别写入 learner-submissions 和 learner-chats，画像、路线与课程状态用 Markdown 保存，供新会话接续教学。</w:t>
+        <w:t>教学 AI 决定课程与路线；课内 Tutor 结合已生成教材解释疑问，并标明当前提问课页。本地 Python 服务同步文件与问答请求：作答和聊天分别存入 learner-submissions 与 learner-chats，画像和路线用 Markdown 保存，供新会话接续教学。</w:t>
       </w:r>
     </w:p>
     <w:p>
@@ -191,7 +191,7 @@
     </w:p>
     <w:p>
       <w:r>
-        <w:t>教学 AI 读取作答和疑难，依据学生的识别、解释、应用和迁移表现调整目标、难度与练习支架。课内答疑补充理解线索，练习记录提供能力判断依据，让下一次教学接着上一次的实际表现推进。</w:t>
+        <w:t>教学 AI 读取作答和疑难，依据学生的识别、解释、应用和迁移表现调整目标、难度与练习支架。课内答疑补充理解线索，练习记录提供能力判断依据，让下一次教学接着上一次的实际表现推进。课程用连贯段落讲清对象、机制与适用条件，反馈指出具体进展和下一步。</w:t>
       </w:r>
     </w:p>
     <w:p>

</xml_diff>

<commit_message>
fix: include live learner answers in lesson tutor context
</commit_message>
<xml_diff>
--- a/example/competition-materials/rc12/学途智伴技能说明文档.docx
+++ b/example/competition-materials/rc12/学途智伴技能说明文档.docx
@@ -20,7 +20,7 @@
     </w:p>
     <w:p>
       <w:r>
-        <w:t>重邮FFBond  ·  校园生活赛道  ·  Teach Pro 1.1.0-rc.17  ·  2026年10月28日</w:t>
+        <w:t>重邮FFBond  ·  校园生活赛道  ·  Teach Pro 1.1.0-rc.18  ·  2026年10月30日</w:t>
       </w:r>
     </w:p>
     <w:p>
@@ -384,7 +384,7 @@
     </w:p>
     <w:p>
       <w:r>
-        <w:t>从答疑进入设置后，点击返回按钮即可回到原课。Tutor 默认结合整门已生成网页教材与本课最近对话回答，选文附带章节和所在段落；即使联系前课，也明确当前提问位置。正文与接口返回的思考分区流式显示。支持复制、修改问题、左右切换版本、重新生成与停止；聊天和图片／文本附件按课保存，供续课 AI 参考。</w:t>
+        <w:t>从答疑进入设置后，点击返回按钮即可回到原课。Tutor 默认结合整门已生成网页教材与本课最近对话回答，选文附带章节和所在段落；填写练习后直接提问，Tutor 同时读取当前课最新作答，结合题干点评。正文与接口返回的思考分区流式显示。支持复制、修改问题、左右切换版本、重新生成与停止；聊天和图片／文本附件按课保存，供续课 AI 参考。</w:t>
       </w:r>
     </w:p>
     <w:p>

</xml_diff>